<commit_message>
feat(inbox/aan): Book 09 Database Physics briefing deck + figure write-back
27-slide spec-compliant deck (Date Code 2026-07-08 12:32 ET): logical vs
physical centralization, speed-of-light floor table, physics-not-procurement
doctrine, SD-WAN benefits 3-step build, lean/fat lanes + SC-5 closure,
token-scoped access, six consistency classes + federal workload table, SSOT
projections, replication-lag rule + SC-8 closure, five data-architecture
principles 5-step build, NIST closure, compliance clock. Write-back adds
db-fig-05/06/07 (physics doctrine, token scope, SSOT projections) to the
qmd; docx re-rendered (7 figures). Zip kit refreshed to 2026-07-08_1234ET
(32 entries).

Co-Authored-By: Claude Fable 5 <noreply@anthropic.com>
</commit_message>
<xml_diff>
--- a/inbox/Application Aware Networking/Book_09_FedAAN_Database_Consolidation_Network_Physics.docx
+++ b/inbox/Application Aware Networking/Book_09_FedAAN_Database_Consolidation_Network_Physics.docx
@@ -31,7 +31,7 @@
         <w:pStyle w:val="Date"/>
       </w:pPr>
       <w:r>
-        <w:t xml:space="preserve">2026-07-01</w:t>
+        <w:t xml:space="preserve">Invalid Date</w:t>
       </w:r>
     </w:p>
     <w:sdt>
@@ -106,7 +106,7 @@
                     <a:graphicData uri="http://schemas.openxmlformats.org/drawingml/2006/picture">
                       <pic:pic>
                         <pic:nvPicPr>
-                          <pic:cNvPr descr="/opt/quarto/share/formats/docx/warning.png" id="11" name="Picture"/>
+                          <pic:cNvPr descr="C:\Program Files\Quarto\share\formats\docx\warning.png" id="11" name="Picture"/>
                           <pic:cNvPicPr>
                             <a:picLocks noChangeArrowheads="1" noChangeAspect="1"/>
                           </pic:cNvPicPr>
@@ -166,7 +166,7 @@
               <w:pStyle w:val="BodyText"/>
             </w:pPr>
             <w:pPr>
-              <w:spacing w:before="16" w:after="16"/>
+              <w:spacing w:before="16"/>
             </w:pPr>
             <w:r>
               <w:t xml:space="preserve">This document is a</w:t>
@@ -199,6 +199,27 @@
             </w:r>
             <w:r>
               <w:t xml:space="preserve">. It is an attempt at a comprehensive SSA-wide technical roadmap and has not been reviewed or approved by the SSA CIO Office, the Office of Information Security (OIS), or organizational leadership. All recommendations, vendor selections, control mappings, and implementation timelines are subject to revision pending formal review by the SSA CIO Office and organizational components.</w:t>
+            </w:r>
+          </w:p>
+          <w:p>
+            <w:pPr>
+              <w:pStyle w:val="BodyText"/>
+            </w:pPr>
+            <w:pPr>
+              <w:spacing w:after="16"/>
+            </w:pPr>
+            <w:r>
+              <w:rPr>
+                <w:b/>
+                <w:bCs/>
+              </w:rPr>
+              <w:t xml:space="preserve">Date Code:</w:t>
+            </w:r>
+            <w:r>
+              <w:t xml:space="preserve"> </w:t>
+            </w:r>
+            <w:r>
+              <w:t xml:space="preserve">2026-07-08 12:36 ET</w:t>
             </w:r>
           </w:p>
           <w:p/>
@@ -259,7 +280,7 @@
                     <a:graphicData uri="http://schemas.openxmlformats.org/drawingml/2006/picture">
                       <pic:pic>
                         <pic:nvPicPr>
-                          <pic:cNvPr descr="/opt/quarto/share/formats/docx/important.png" id="14" name="Picture"/>
+                          <pic:cNvPr descr="C:\Program Files\Quarto\share\formats\docx\important.png" id="14" name="Picture"/>
                           <pic:cNvPicPr>
                             <a:picLocks noChangeArrowheads="1" noChangeAspect="1"/>
                           </pic:cNvPicPr>
@@ -678,7 +699,7 @@
     </w:p>
     <w:bookmarkEnd w:id="21"/>
     <w:bookmarkEnd w:id="22"/>
-    <w:bookmarkStart w:id="30" w:name="the-speed-of-light-tax"/>
+    <w:bookmarkStart w:id="34" w:name="the-speed-of-light-tax"/>
     <w:p>
       <w:pPr>
         <w:pStyle w:val="Heading1"/>
@@ -1400,7 +1421,7 @@
       </w:r>
     </w:p>
     <w:bookmarkEnd w:id="28"/>
-    <w:bookmarkStart w:id="29" w:name="physics-is-not-a-procurement-decision"/>
+    <w:bookmarkStart w:id="33" w:name="physics-is-not-a-procurement-decision"/>
     <w:p>
       <w:pPr>
         <w:pStyle w:val="Heading2"/>
@@ -1487,25 +1508,6 @@
       </w:pPr>
       <w:r>
         <w:t xml:space="preserve">Applied to this document’s subject, the doctrine reads: place the primary at the regional center of gravity of its write consumers, because that is arranging around the floor; let SD-WAN attack the addressable gap between the floor and observed latency, because that is the portion engineering can reach; assign each workload the consistency class its geography can actually deliver, because pretending otherwise just relocates the physics into mysterious query latency. Architecture is not the act of overcoming physics. It is the act of arranging around what physics permits — and the propagation floor is where that discipline starts.</w:t>
-      </w:r>
-    </w:p>
-    <w:bookmarkEnd w:id="29"/>
-    <w:bookmarkEnd w:id="30"/>
-    <w:bookmarkStart w:id="38" w:name="sd-wan-as-the-databases-network-ally"/>
-    <w:p>
-      <w:pPr>
-        <w:pStyle w:val="Heading1"/>
-      </w:pPr>
-      <w:r>
-        <w:t xml:space="preserve">4. SD-WAN as the Database’s Network Ally</w:t>
-      </w:r>
-    </w:p>
-    <w:p>
-      <w:pPr>
-        <w:pStyle w:val="FirstParagraph"/>
-      </w:pPr>
-      <w:r>
-        <w:t xml:space="preserve">SD-WAN does not eliminate the physics floor. What it does is reduce the gap between the physics floor and the observed latency, and it separates traffic classes so that high-priority database traffic is not competing with bulk data transfers for the same network path.</w:t>
       </w:r>
     </w:p>
     <w:tbl>
@@ -1521,7 +1523,7 @@
       <w:tr>
         <w:tc>
           <w:tcPr/>
-          <w:bookmarkStart w:id="34" w:name="fig-db03"/>
+          <w:bookmarkStart w:id="32" w:name="fig-db05"/>
           <w:p>
             <w:pPr>
               <w:pStyle w:val="Compact"/>
@@ -1530,20 +1532,118 @@
             <w:r>
               <w:drawing>
                 <wp:inline>
-                  <wp:extent cx="5334000" cy="2359269"/>
+                  <wp:extent cx="5334000" cy="3000375"/>
                   <wp:effectExtent b="0" l="0" r="0" t="0"/>
-                  <wp:docPr descr="" title="" id="32" name="Picture"/>
+                  <wp:docPr descr="" title="" id="30" name="Picture"/>
                   <a:graphic>
                     <a:graphicData uri="http://schemas.openxmlformats.org/drawingml/2006/picture">
                       <pic:pic>
                         <pic:nvPicPr>
-                          <pic:cNvPr descr="figs/db-fig-03-sdwan-traffic-class.png" id="33" name="Picture"/>
+                          <pic:cNvPr descr="figs/db-fig-05-physics-not-procurement.png" id="31" name="Picture"/>
                           <pic:cNvPicPr>
                             <a:picLocks noChangeArrowheads="1" noChangeAspect="1"/>
                           </pic:cNvPicPr>
                         </pic:nvPicPr>
                         <pic:blipFill>
-                          <a:blip r:embed="rId31"/>
+                          <a:blip r:embed="rId29"/>
+                          <a:stretch>
+                            <a:fillRect/>
+                          </a:stretch>
+                        </pic:blipFill>
+                        <pic:spPr bwMode="auto">
+                          <a:xfrm>
+                            <a:off x="0" y="0"/>
+                            <a:ext cx="5334000" cy="3000375"/>
+                          </a:xfrm>
+                          <a:prstGeom prst="rect">
+                            <a:avLst/>
+                          </a:prstGeom>
+                          <a:noFill/>
+                          <a:ln w="9525">
+                            <a:noFill/>
+                            <a:headEnd/>
+                            <a:tailEnd/>
+                          </a:ln>
+                        </pic:spPr>
+                      </pic:pic>
+                    </a:graphicData>
+                  </a:graphic>
+                </wp:inline>
+              </w:drawing>
+            </w:r>
+          </w:p>
+          <w:p>
+            <w:pPr>
+              <w:jc w:val="center"/>
+            </w:pPr>
+            <w:pPr>
+              <w:jc w:val="left"/>
+              <w:spacing w:before="200"/>
+              <w:pStyle w:val="ImageCaption"/>
+            </w:pPr>
+            <w:r>
+              <w:t xml:space="preserve">Figure 3: Physics is not a procurement decision</w:t>
+            </w:r>
+          </w:p>
+          <w:bookmarkEnd w:id="32"/>
+        </w:tc>
+      </w:tr>
+    </w:tbl>
+    <w:bookmarkEnd w:id="33"/>
+    <w:bookmarkEnd w:id="34"/>
+    <w:bookmarkStart w:id="42" w:name="sd-wan-as-the-databases-network-ally"/>
+    <w:p>
+      <w:pPr>
+        <w:pStyle w:val="Heading1"/>
+      </w:pPr>
+      <w:r>
+        <w:t xml:space="preserve">4. SD-WAN as the Database’s Network Ally</w:t>
+      </w:r>
+    </w:p>
+    <w:p>
+      <w:pPr>
+        <w:pStyle w:val="FirstParagraph"/>
+      </w:pPr>
+      <w:r>
+        <w:t xml:space="preserve">SD-WAN does not eliminate the physics floor. What it does is reduce the gap between the physics floor and the observed latency, and it separates traffic classes so that high-priority database traffic is not competing with bulk data transfers for the same network path.</w:t>
+      </w:r>
+    </w:p>
+    <w:tbl>
+      <w:tblPr>
+        <w:tblStyle w:val="Table"/>
+        <w:tblW w:type="pct" w:w="5000"/>
+        <w:tblLayout w:type="fixed"/>
+        <w:tblLook w:firstRow="0" w:lastRow="0" w:firstColumn="0" w:lastColumn="0" w:noHBand="0" w:noVBand="0" w:val="0000"/>
+      </w:tblPr>
+      <w:tblGrid>
+        <w:gridCol w:w="7920"/>
+      </w:tblGrid>
+      <w:tr>
+        <w:tc>
+          <w:tcPr/>
+          <w:bookmarkStart w:id="38" w:name="fig-db03"/>
+          <w:p>
+            <w:pPr>
+              <w:pStyle w:val="Compact"/>
+              <w:jc w:val="center"/>
+            </w:pPr>
+            <w:r>
+              <w:drawing>
+                <wp:inline>
+                  <wp:extent cx="5334000" cy="2359269"/>
+                  <wp:effectExtent b="0" l="0" r="0" t="0"/>
+                  <wp:docPr descr="" title="" id="36" name="Picture"/>
+                  <a:graphic>
+                    <a:graphicData uri="http://schemas.openxmlformats.org/drawingml/2006/picture">
+                      <pic:pic>
+                        <pic:nvPicPr>
+                          <pic:cNvPr descr="figs/db-fig-03-sdwan-traffic-class.png" id="37" name="Picture"/>
+                          <pic:cNvPicPr>
+                            <a:picLocks noChangeArrowheads="1" noChangeAspect="1"/>
+                          </pic:cNvPicPr>
+                        </pic:nvPicPr>
+                        <pic:blipFill>
+                          <a:blip r:embed="rId35"/>
                           <a:stretch>
                             <a:fillRect/>
                           </a:stretch>
@@ -1580,14 +1680,14 @@
               <w:pStyle w:val="ImageCaption"/>
             </w:pPr>
             <w:r>
-              <w:t xml:space="preserve">Figure 3: SD-WAN separates database traffic into lean (low-latency) and fat (bulk) lanes, protecting consensus quorum ACKs from competing with backup and replication transfers.</w:t>
-            </w:r>
-          </w:p>
-          <w:bookmarkEnd w:id="34"/>
+              <w:t xml:space="preserve">Figure 4: SD-WAN separates database traffic into lean (low-latency) and fat (bulk) lanes, protecting consensus quorum ACKs from competing with backup and replication transfers.</w:t>
+            </w:r>
+          </w:p>
+          <w:bookmarkEnd w:id="38"/>
         </w:tc>
       </w:tr>
     </w:tbl>
-    <w:bookmarkStart w:id="35" w:name="near-geodesic-routing"/>
+    <w:bookmarkStart w:id="39" w:name="near-geodesic-routing"/>
     <w:p>
       <w:pPr>
         <w:pStyle w:val="Heading2"/>
@@ -1620,8 +1720,8 @@
         <w:t xml:space="preserve">For database applications, near-geodesic routing reduces the observed latency toward the physics floor. The DC-to-Oregon route that takes 95ms over an MPLS path with Midwest hops may take 68ms over a direct broadband path with west-coast peering.</w:t>
       </w:r>
     </w:p>
-    <w:bookmarkEnd w:id="35"/>
-    <w:bookmarkStart w:id="36" w:name="three-benefits-for-database-architecture"/>
+    <w:bookmarkEnd w:id="39"/>
+    <w:bookmarkStart w:id="40" w:name="three-benefits-for-database-architecture"/>
     <w:p>
       <w:pPr>
         <w:pStyle w:val="Heading2"/>
@@ -1736,8 +1836,8 @@
         <w:t xml:space="preserve">Without traffic class separation, a large backup job running at the same time as a database failover election can flood the available bandwidth and delay the heartbeat that determines quorum. With separation, the backup job runs on a completely separate path — the lean lane is protected regardless of bulk traffic volume.</w:t>
       </w:r>
     </w:p>
-    <w:bookmarkEnd w:id="36"/>
-    <w:bookmarkStart w:id="37" w:name="the-lean-fat-design-rule"/>
+    <w:bookmarkEnd w:id="40"/>
+    <w:bookmarkStart w:id="41" w:name="the-lean-fat-design-rule"/>
     <w:p>
       <w:pPr>
         <w:pStyle w:val="Heading2"/>
@@ -1864,9 +1964,9 @@
         <w:t xml:space="preserve">SC-5 requires the system to protect against or limit the effects of organization-defined denial-of-service events. For a distributed database cluster, the defining event is internal: a bulk replication or backup stream that floods the path carrying quorum ACKs, delaying heartbeats until the cluster loses quorum. More bandwidth does not close this — bulk transfers expand to fill whatever pipe exists. Database-side throttling does not close it — the engine cannot see or schedule the network path. The only mechanism that separates quorum ACKs from bulk replication on a shared path is SD-WAN traffic-class marking with per-class queuing and path policy. There is no circuit size, backup window, or configuration setting that closes SC-5 for a distributed cluster on an unclassified path.</w:t>
       </w:r>
     </w:p>
-    <w:bookmarkEnd w:id="37"/>
-    <w:bookmarkEnd w:id="38"/>
-    <w:bookmarkStart w:id="42" w:name="Xfbb1f7773042e08616c17be8eb76330402b25e8"/>
+    <w:bookmarkEnd w:id="41"/>
+    <w:bookmarkEnd w:id="42"/>
+    <w:bookmarkStart w:id="50" w:name="Xfbb1f7773042e08616c17be8eb76330402b25e8"/>
     <w:p>
       <w:pPr>
         <w:pStyle w:val="Heading1"/>
@@ -1883,7 +1983,7 @@
         <w:t xml:space="preserve">The shift from perimeter-based to token-based security is not merely an authentication change. It is an architectural change that removes the network perimeter as the primary access control mechanism for databases.</w:t>
       </w:r>
     </w:p>
-    <w:bookmarkStart w:id="39" w:name="what-the-perimeter-was-providing"/>
+    <w:bookmarkStart w:id="43" w:name="what-the-perimeter-was-providing"/>
     <w:p>
       <w:pPr>
         <w:pStyle w:val="Heading2"/>
@@ -1972,8 +2072,8 @@
         <w:t xml:space="preserve">A stolen token is scoped to one resource for one hour. It cannot be used for lateral movement to other resources. It cannot be reused after expiration. It cannot be used from a non-compliant device if the Conditional Access policy requires device compliance.</w:t>
       </w:r>
     </w:p>
-    <w:bookmarkEnd w:id="39"/>
-    <w:bookmarkStart w:id="40" w:name="Xece8304eb3395c54de6330562c48461e66a0c87"/>
+    <w:bookmarkEnd w:id="43"/>
+    <w:bookmarkStart w:id="48" w:name="Xece8304eb3395c54de6330562c48461e66a0c87"/>
     <w:p>
       <w:pPr>
         <w:pStyle w:val="Heading2"/>
@@ -2004,78 +2104,6 @@
       </w:pPr>
       <w:r>
         <w:t xml:space="preserve">This is why the zero-trust architecture enables more aggressive database consolidation: the security model no longer requires database fragmentation to maintain access control isolation.</w:t>
-      </w:r>
-    </w:p>
-    <w:bookmarkEnd w:id="40"/>
-    <w:bookmarkStart w:id="41" w:name="token-scope-and-database-authorization"/>
-    <w:p>
-      <w:pPr>
-        <w:pStyle w:val="Heading2"/>
-      </w:pPr>
-      <w:r>
-        <w:t xml:space="preserve">5.3 Token Scope and Database Authorization</w:t>
-      </w:r>
-    </w:p>
-    <w:p>
-      <w:pPr>
-        <w:pStyle w:val="FirstParagraph"/>
-      </w:pPr>
-      <w:r>
-        <w:t xml:space="preserve">Entra access tokens for SQL Server are scoped to the specific SQL Server resource. A token issued for</w:t>
-      </w:r>
-      <w:r>
-        <w:t xml:space="preserve"> </w:t>
-      </w:r>
-      <w:r>
-        <w:rPr>
-          <w:rStyle w:val="VerbatimChar"/>
-        </w:rPr>
-        <w:t xml:space="preserve">sql01.agency.gov</w:t>
-      </w:r>
-      <w:r>
-        <w:t xml:space="preserve"> </w:t>
-      </w:r>
-      <w:r>
-        <w:t xml:space="preserve">is not valid against</w:t>
-      </w:r>
-      <w:r>
-        <w:t xml:space="preserve"> </w:t>
-      </w:r>
-      <w:r>
-        <w:rPr>
-          <w:rStyle w:val="VerbatimChar"/>
-        </w:rPr>
-        <w:t xml:space="preserve">sql02.agency.gov</w:t>
-      </w:r>
-      <w:r>
-        <w:t xml:space="preserve">. Token scope provides the access control isolation that the perimeter model achieved through network segmentation.</w:t>
-      </w:r>
-    </w:p>
-    <w:p>
-      <w:pPr>
-        <w:pStyle w:val="BodyText"/>
-      </w:pPr>
-      <w:r>
-        <w:t xml:space="preserve">Within a SQL Server instance, the token identifies the principal (user or Managed Identity). Database authorization — role membership, schema permissions, row-level security — applies to the identified principal exactly as it would for any other authenticated principal. Token-based authentication does not change the SQL Server permission model; it changes the authentication surface that establishes the principal identity.</w:t>
-      </w:r>
-    </w:p>
-    <w:bookmarkEnd w:id="41"/>
-    <w:bookmarkEnd w:id="42"/>
-    <w:bookmarkStart w:id="51" w:name="X8708633d8781b5027e2377a4fc03650b6e96028"/>
-    <w:p>
-      <w:pPr>
-        <w:pStyle w:val="Heading1"/>
-      </w:pPr>
-      <w:r>
-        <w:t xml:space="preserve">6. Consistency Classes and Transport Classes</w:t>
-      </w:r>
-    </w:p>
-    <w:p>
-      <w:pPr>
-        <w:pStyle w:val="FirstParagraph"/>
-      </w:pPr>
-      <w:r>
-        <w:t xml:space="preserve">The central design decision in distributed database architecture is matching the consistency class of the data to the transport class of the network. Mismatches are expensive: strong consistency over a high-latency link adds the latency cost to every read; eventual consistency over a low-latency link wastes the low-latency investment.</w:t>
       </w:r>
     </w:p>
     <w:tbl>
@@ -2091,7 +2119,7 @@
       <w:tr>
         <w:tc>
           <w:tcPr/>
-          <w:bookmarkStart w:id="46" w:name="fig-db04"/>
+          <w:bookmarkStart w:id="47" w:name="fig-db06"/>
           <w:p>
             <w:pPr>
               <w:pStyle w:val="Compact"/>
@@ -2100,20 +2128,171 @@
             <w:r>
               <w:drawing>
                 <wp:inline>
-                  <wp:extent cx="5334000" cy="2082311"/>
+                  <wp:extent cx="5334000" cy="3000375"/>
                   <wp:effectExtent b="0" l="0" r="0" t="0"/>
-                  <wp:docPr descr="" title="" id="44" name="Picture"/>
+                  <wp:docPr descr="" title="" id="45" name="Picture"/>
                   <a:graphic>
                     <a:graphicData uri="http://schemas.openxmlformats.org/drawingml/2006/picture">
                       <pic:pic>
                         <pic:nvPicPr>
-                          <pic:cNvPr descr="figs/db-fig-04-consistency-transport.png" id="45" name="Picture"/>
+                          <pic:cNvPr descr="figs/db-fig-06-token-scope.png" id="46" name="Picture"/>
                           <pic:cNvPicPr>
                             <a:picLocks noChangeArrowheads="1" noChangeAspect="1"/>
                           </pic:cNvPicPr>
                         </pic:nvPicPr>
                         <pic:blipFill>
-                          <a:blip r:embed="rId43"/>
+                          <a:blip r:embed="rId44"/>
+                          <a:stretch>
+                            <a:fillRect/>
+                          </a:stretch>
+                        </pic:blipFill>
+                        <pic:spPr bwMode="auto">
+                          <a:xfrm>
+                            <a:off x="0" y="0"/>
+                            <a:ext cx="5334000" cy="3000375"/>
+                          </a:xfrm>
+                          <a:prstGeom prst="rect">
+                            <a:avLst/>
+                          </a:prstGeom>
+                          <a:noFill/>
+                          <a:ln w="9525">
+                            <a:noFill/>
+                            <a:headEnd/>
+                            <a:tailEnd/>
+                          </a:ln>
+                        </pic:spPr>
+                      </pic:pic>
+                    </a:graphicData>
+                  </a:graphic>
+                </wp:inline>
+              </w:drawing>
+            </w:r>
+          </w:p>
+          <w:p>
+            <w:pPr>
+              <w:jc w:val="center"/>
+            </w:pPr>
+            <w:pPr>
+              <w:jc w:val="left"/>
+              <w:spacing w:before="200"/>
+              <w:pStyle w:val="ImageCaption"/>
+            </w:pPr>
+            <w:r>
+              <w:t xml:space="preserve">Figure 5: The token is the perimeter: scoped four ways, portable nowhere</w:t>
+            </w:r>
+          </w:p>
+          <w:bookmarkEnd w:id="47"/>
+        </w:tc>
+      </w:tr>
+    </w:tbl>
+    <w:bookmarkEnd w:id="48"/>
+    <w:bookmarkStart w:id="49" w:name="token-scope-and-database-authorization"/>
+    <w:p>
+      <w:pPr>
+        <w:pStyle w:val="Heading2"/>
+      </w:pPr>
+      <w:r>
+        <w:t xml:space="preserve">5.3 Token Scope and Database Authorization</w:t>
+      </w:r>
+    </w:p>
+    <w:p>
+      <w:pPr>
+        <w:pStyle w:val="FirstParagraph"/>
+      </w:pPr>
+      <w:r>
+        <w:t xml:space="preserve">Entra access tokens for SQL Server are scoped to the specific SQL Server resource. A token issued for</w:t>
+      </w:r>
+      <w:r>
+        <w:t xml:space="preserve"> </w:t>
+      </w:r>
+      <w:r>
+        <w:rPr>
+          <w:rStyle w:val="VerbatimChar"/>
+        </w:rPr>
+        <w:t xml:space="preserve">sql01.agency.gov</w:t>
+      </w:r>
+      <w:r>
+        <w:t xml:space="preserve"> </w:t>
+      </w:r>
+      <w:r>
+        <w:t xml:space="preserve">is not valid against</w:t>
+      </w:r>
+      <w:r>
+        <w:t xml:space="preserve"> </w:t>
+      </w:r>
+      <w:r>
+        <w:rPr>
+          <w:rStyle w:val="VerbatimChar"/>
+        </w:rPr>
+        <w:t xml:space="preserve">sql02.agency.gov</w:t>
+      </w:r>
+      <w:r>
+        <w:t xml:space="preserve">. Token scope provides the access control isolation that the perimeter model achieved through network segmentation.</w:t>
+      </w:r>
+    </w:p>
+    <w:p>
+      <w:pPr>
+        <w:pStyle w:val="BodyText"/>
+      </w:pPr>
+      <w:r>
+        <w:t xml:space="preserve">Within a SQL Server instance, the token identifies the principal (user or Managed Identity). Database authorization — role membership, schema permissions, row-level security — applies to the identified principal exactly as it would for any other authenticated principal. Token-based authentication does not change the SQL Server permission model; it changes the authentication surface that establishes the principal identity.</w:t>
+      </w:r>
+    </w:p>
+    <w:bookmarkEnd w:id="49"/>
+    <w:bookmarkEnd w:id="50"/>
+    <w:bookmarkStart w:id="63" w:name="X8708633d8781b5027e2377a4fc03650b6e96028"/>
+    <w:p>
+      <w:pPr>
+        <w:pStyle w:val="Heading1"/>
+      </w:pPr>
+      <w:r>
+        <w:t xml:space="preserve">6. Consistency Classes and Transport Classes</w:t>
+      </w:r>
+    </w:p>
+    <w:p>
+      <w:pPr>
+        <w:pStyle w:val="FirstParagraph"/>
+      </w:pPr>
+      <w:r>
+        <w:t xml:space="preserve">The central design decision in distributed database architecture is matching the consistency class of the data to the transport class of the network. Mismatches are expensive: strong consistency over a high-latency link adds the latency cost to every read; eventual consistency over a low-latency link wastes the low-latency investment.</w:t>
+      </w:r>
+    </w:p>
+    <w:tbl>
+      <w:tblPr>
+        <w:tblStyle w:val="Table"/>
+        <w:tblW w:type="pct" w:w="5000"/>
+        <w:tblLayout w:type="fixed"/>
+        <w:tblLook w:firstRow="0" w:lastRow="0" w:firstColumn="0" w:lastColumn="0" w:noHBand="0" w:noVBand="0" w:val="0000"/>
+      </w:tblPr>
+      <w:tblGrid>
+        <w:gridCol w:w="7920"/>
+      </w:tblGrid>
+      <w:tr>
+        <w:tc>
+          <w:tcPr/>
+          <w:bookmarkStart w:id="54" w:name="fig-db04"/>
+          <w:p>
+            <w:pPr>
+              <w:pStyle w:val="Compact"/>
+              <w:jc w:val="center"/>
+            </w:pPr>
+            <w:r>
+              <w:drawing>
+                <wp:inline>
+                  <wp:extent cx="5334000" cy="2082311"/>
+                  <wp:effectExtent b="0" l="0" r="0" t="0"/>
+                  <wp:docPr descr="" title="" id="52" name="Picture"/>
+                  <a:graphic>
+                    <a:graphicData uri="http://schemas.openxmlformats.org/drawingml/2006/picture">
+                      <pic:pic>
+                        <pic:nvPicPr>
+                          <pic:cNvPr descr="figs/db-fig-04-consistency-transport.png" id="53" name="Picture"/>
+                          <pic:cNvPicPr>
+                            <a:picLocks noChangeArrowheads="1" noChangeAspect="1"/>
+                          </pic:cNvPicPr>
+                        </pic:nvPicPr>
+                        <pic:blipFill>
+                          <a:blip r:embed="rId51"/>
                           <a:stretch>
                             <a:fillRect/>
                           </a:stretch>
@@ -2150,14 +2329,14 @@
               <w:pStyle w:val="ImageCaption"/>
             </w:pPr>
             <w:r>
-              <w:t xml:space="preserve">Figure 4: Consistency class must be matched to transport class. Strong consistency belongs intra-region; async replication and eventual consistency are appropriate for cross-region.</w:t>
-            </w:r>
-          </w:p>
-          <w:bookmarkEnd w:id="46"/>
+              <w:t xml:space="preserve">Figure 6: Consistency class must be matched to transport class. Strong consistency belongs intra-region; async replication and eventual consistency are appropriate for cross-region.</w:t>
+            </w:r>
+          </w:p>
+          <w:bookmarkEnd w:id="54"/>
         </w:tc>
       </w:tr>
     </w:tbl>
-    <w:bookmarkStart w:id="47" w:name="the-six-consistency-classes"/>
+    <w:bookmarkStart w:id="55" w:name="the-six-consistency-classes"/>
     <w:p>
       <w:pPr>
         <w:pStyle w:val="Heading2"/>
@@ -2274,8 +2453,8 @@
         <w:t xml:space="preserve">No guarantee on read recency. A write will eventually propagate to all replicas, but a read may see any version. Best for: analytics, reporting, search indexes, recommendation systems — workloads where exactness is less important than throughput.</w:t>
       </w:r>
     </w:p>
-    <w:bookmarkEnd w:id="47"/>
-    <w:bookmarkStart w:id="48" w:name="the-design-rule"/>
+    <w:bookmarkEnd w:id="55"/>
+    <w:bookmarkStart w:id="56" w:name="the-design-rule"/>
     <w:p>
       <w:pPr>
         <w:pStyle w:val="Heading2"/>
@@ -2338,8 +2517,8 @@
         <w:t xml:space="preserve">deploying a globally distributed database with strong consistency configured for all reads. The observable symptom is read latency that is inexplicably high — because every read from a regional replica is paying a cross-region round trip to verify consistency. The fix is to move the strong consistency requirement intra-region and downgrade cross-region reads to bounded staleness.</w:t>
       </w:r>
     </w:p>
-    <w:bookmarkEnd w:id="48"/>
-    <w:bookmarkStart w:id="49" w:name="federal-workload-classifications"/>
+    <w:bookmarkEnd w:id="56"/>
+    <w:bookmarkStart w:id="57" w:name="federal-workload-classifications"/>
     <w:p>
       <w:pPr>
         <w:pStyle w:val="Heading2"/>
@@ -2687,8 +2866,8 @@
         </w:tc>
       </w:tr>
     </w:tbl>
-    <w:bookmarkEnd w:id="49"/>
-    <w:bookmarkStart w:id="50" w:name="the-ssot-consequence"/>
+    <w:bookmarkEnd w:id="57"/>
+    <w:bookmarkStart w:id="62" w:name="the-ssot-consequence"/>
     <w:p>
       <w:pPr>
         <w:pStyle w:val="Heading2"/>
@@ -2758,9 +2937,88 @@
         <w:t xml:space="preserve">: one canonical source, multiple consistency-class projections for different consumer types. The canonical source provides strong consistency to consumers that need it. Derived stores provide bounded staleness or eventual consistency to consumers that can tolerate it. No reconciliation is needed — the derived stores are populated from the canonical source via defined replication paths, not maintained independently.</w:t>
       </w:r>
     </w:p>
-    <w:bookmarkEnd w:id="50"/>
-    <w:bookmarkEnd w:id="51"/>
-    <w:bookmarkStart w:id="54" w:name="X1f49b768f482b996475d9c4b199be1f251e60a2"/>
+    <w:tbl>
+      <w:tblPr>
+        <w:tblStyle w:val="Table"/>
+        <w:tblW w:type="pct" w:w="5000"/>
+        <w:tblLayout w:type="fixed"/>
+        <w:tblLook w:firstRow="0" w:lastRow="0" w:firstColumn="0" w:lastColumn="0" w:noHBand="0" w:noVBand="0" w:val="0000"/>
+      </w:tblPr>
+      <w:tblGrid>
+        <w:gridCol w:w="7920"/>
+      </w:tblGrid>
+      <w:tr>
+        <w:tc>
+          <w:tcPr/>
+          <w:bookmarkStart w:id="61" w:name="fig-db07"/>
+          <w:p>
+            <w:pPr>
+              <w:pStyle w:val="Compact"/>
+              <w:jc w:val="center"/>
+            </w:pPr>
+            <w:r>
+              <w:drawing>
+                <wp:inline>
+                  <wp:extent cx="5334000" cy="3000375"/>
+                  <wp:effectExtent b="0" l="0" r="0" t="0"/>
+                  <wp:docPr descr="" title="" id="59" name="Picture"/>
+                  <a:graphic>
+                    <a:graphicData uri="http://schemas.openxmlformats.org/drawingml/2006/picture">
+                      <pic:pic>
+                        <pic:nvPicPr>
+                          <pic:cNvPr descr="figs/db-fig-07-ssot-projections.png" id="60" name="Picture"/>
+                          <pic:cNvPicPr>
+                            <a:picLocks noChangeArrowheads="1" noChangeAspect="1"/>
+                          </pic:cNvPicPr>
+                        </pic:nvPicPr>
+                        <pic:blipFill>
+                          <a:blip r:embed="rId58"/>
+                          <a:stretch>
+                            <a:fillRect/>
+                          </a:stretch>
+                        </pic:blipFill>
+                        <pic:spPr bwMode="auto">
+                          <a:xfrm>
+                            <a:off x="0" y="0"/>
+                            <a:ext cx="5334000" cy="3000375"/>
+                          </a:xfrm>
+                          <a:prstGeom prst="rect">
+                            <a:avLst/>
+                          </a:prstGeom>
+                          <a:noFill/>
+                          <a:ln w="9525">
+                            <a:noFill/>
+                            <a:headEnd/>
+                            <a:tailEnd/>
+                          </a:ln>
+                        </pic:spPr>
+                      </pic:pic>
+                    </a:graphicData>
+                  </a:graphic>
+                </wp:inline>
+              </w:drawing>
+            </w:r>
+          </w:p>
+          <w:p>
+            <w:pPr>
+              <w:jc w:val="center"/>
+            </w:pPr>
+            <w:pPr>
+              <w:jc w:val="left"/>
+              <w:spacing w:before="200"/>
+              <w:pStyle w:val="ImageCaption"/>
+            </w:pPr>
+            <w:r>
+              <w:t xml:space="preserve">Figure 7: One canonical source, many consistency-class projections</w:t>
+            </w:r>
+          </w:p>
+          <w:bookmarkEnd w:id="61"/>
+        </w:tc>
+      </w:tr>
+    </w:tbl>
+    <w:bookmarkEnd w:id="62"/>
+    <w:bookmarkEnd w:id="63"/>
+    <w:bookmarkStart w:id="66" w:name="X1f49b768f482b996475d9c4b199be1f251e60a2"/>
     <w:p>
       <w:pPr>
         <w:pStyle w:val="Heading1"/>
@@ -2777,7 +3035,7 @@
         <w:t xml:space="preserve">Parts 5 and 6 of this series addressed SD-WAN overlay architecture for network traffic and application layer protocols. The same overlay principles apply to database replication traffic, extending the traffic classification described earlier in this document.</w:t>
       </w:r>
     </w:p>
-    <w:bookmarkStart w:id="52" w:name="X384322f0eb2fa7313c04caf9958f01de5eeda42"/>
+    <w:bookmarkStart w:id="64" w:name="X384322f0eb2fa7313c04caf9958f01de5eeda42"/>
     <w:p>
       <w:pPr>
         <w:pStyle w:val="Heading2"/>
@@ -2872,8 +3130,8 @@
         <w:t xml:space="preserve">replication traffic on an inter-site path regardless of application behavior is the SD-WAN IPsec overlay. Per-protocol TLS settings can harden individual streams; they cannot make a claim about the path. SC-8 on the replication path closes at the network layer or it does not close.</w:t>
       </w:r>
     </w:p>
-    <w:bookmarkEnd w:id="52"/>
-    <w:bookmarkStart w:id="53" w:name="overlay-vs.-underlay-consistency"/>
+    <w:bookmarkEnd w:id="64"/>
+    <w:bookmarkStart w:id="65" w:name="overlay-vs.-underlay-consistency"/>
     <w:p>
       <w:pPr>
         <w:pStyle w:val="Heading2"/>
@@ -2914,9 +3172,9 @@
         <w:t xml:space="preserve">The correct design: configure the database cluster to monitor replication lag explicitly and expose it as a metric. Route reads to secondaries only when their lag is within the configured bound. If the lag exceeds the bound, redirect reads to the primary rather than serving stale data that violates the bounded-staleness commitment.</w:t>
       </w:r>
     </w:p>
-    <w:bookmarkEnd w:id="53"/>
-    <w:bookmarkEnd w:id="54"/>
-    <w:bookmarkStart w:id="60" w:name="federal-data-architecture-principles"/>
+    <w:bookmarkEnd w:id="65"/>
+    <w:bookmarkEnd w:id="66"/>
+    <w:bookmarkStart w:id="72" w:name="federal-data-architecture-principles"/>
     <w:p>
       <w:pPr>
         <w:pStyle w:val="Heading1"/>
@@ -2925,7 +3183,7 @@
         <w:t xml:space="preserve">8. Federal Data Architecture Principles</w:t>
       </w:r>
     </w:p>
-    <w:bookmarkStart w:id="55" w:name="principle-1-one-truth-many-projections"/>
+    <w:bookmarkStart w:id="67" w:name="principle-1-one-truth-many-projections"/>
     <w:p>
       <w:pPr>
         <w:pStyle w:val="Heading2"/>
@@ -2978,8 +3236,8 @@
         <w:t xml:space="preserve">Lineage tracking: the derivation path from canonical source to each projection is documented and monitored</w:t>
       </w:r>
     </w:p>
-    <w:bookmarkEnd w:id="55"/>
-    <w:bookmarkStart w:id="56" w:name="X4b01a6aa66421a5a57f0bd0726276f01e5ffa37"/>
+    <w:bookmarkEnd w:id="67"/>
+    <w:bookmarkStart w:id="68" w:name="X4b01a6aa66421a5a57f0bd0726276f01e5ffa37"/>
     <w:p>
       <w:pPr>
         <w:pStyle w:val="Heading2"/>
@@ -3032,8 +3290,8 @@
         <w:t xml:space="preserve">Use async replication and bounded-staleness reads to serve cross-region readers at the consistency class appropriate to their use case</w:t>
       </w:r>
     </w:p>
-    <w:bookmarkEnd w:id="56"/>
-    <w:bookmarkStart w:id="57" w:name="principle-3-consistency-class-alignment"/>
+    <w:bookmarkEnd w:id="68"/>
+    <w:bookmarkStart w:id="69" w:name="principle-3-consistency-class-alignment"/>
     <w:p>
       <w:pPr>
         <w:pStyle w:val="Heading2"/>
@@ -3106,8 +3364,8 @@
         <w:t xml:space="preserve">which is the most expensive possible choice and often the source of mysterious latency in distributed federal systems.</w:t>
       </w:r>
     </w:p>
-    <w:bookmarkEnd w:id="57"/>
-    <w:bookmarkStart w:id="58" w:name="X069ff3e4aead2e470a6c349a390ff210177132c"/>
+    <w:bookmarkEnd w:id="69"/>
+    <w:bookmarkStart w:id="70" w:name="X069ff3e4aead2e470a6c349a390ff210177132c"/>
     <w:p>
       <w:pPr>
         <w:pStyle w:val="Heading2"/>
@@ -3132,8 +3390,8 @@
         <w:t xml:space="preserve">SD-WAN traffic classification, DSCP marking, and dedicated paths for lean vs. fat database traffic are not gold-plating. They are the minimum viable network design for a distributed database cluster.</w:t>
       </w:r>
     </w:p>
-    <w:bookmarkEnd w:id="58"/>
-    <w:bookmarkStart w:id="59" w:name="X9975fb4c9bfd91a3c59fb43ba5855d7424eea60"/>
+    <w:bookmarkEnd w:id="70"/>
+    <w:bookmarkStart w:id="71" w:name="X9975fb4c9bfd91a3c59fb43ba5855d7424eea60"/>
     <w:p>
       <w:pPr>
         <w:pStyle w:val="Heading2"/>
@@ -3158,9 +3416,9 @@
         <w:t xml:space="preserve">The perimeter is not eliminated — firewalls still exist and still block unauthenticated connection attempts. But the perimeter is no longer the primary access control mechanism. It is a defense-in-depth layer. The primary access control is the token, the Conditional Access policy, and the database authorization model.</w:t>
       </w:r>
     </w:p>
-    <w:bookmarkEnd w:id="59"/>
-    <w:bookmarkEnd w:id="60"/>
-    <w:bookmarkStart w:id="61" w:name="nist-control-closure"/>
+    <w:bookmarkEnd w:id="71"/>
+    <w:bookmarkEnd w:id="72"/>
+    <w:bookmarkStart w:id="73" w:name="nist-control-closure"/>
     <w:p>
       <w:pPr>
         <w:pStyle w:val="Heading1"/>
@@ -3646,8 +3904,8 @@
         </w:tc>
       </w:tr>
     </w:tbl>
-    <w:bookmarkEnd w:id="61"/>
-    <w:bookmarkStart w:id="62" w:name="summary"/>
+    <w:bookmarkEnd w:id="73"/>
+    <w:bookmarkStart w:id="74" w:name="summary"/>
     <w:p>
       <w:pPr>
         <w:pStyle w:val="Heading1"/>
@@ -3704,7 +3962,7 @@
         <w:t xml:space="preserve">Together with the SQL Server authentication modernization (Parts 7 and 8) and the network controls established in Parts 1 through 6, this architectural framework closes the FedRAMP 20x gap in the database and data management layer.</w:t>
       </w:r>
     </w:p>
-    <w:bookmarkEnd w:id="62"/>
+    <w:bookmarkEnd w:id="74"/>
     <w:sectPr>
       <w:footnotePr>
         <w:numRestart w:val="eachSect"/>

</xml_diff>

<commit_message>
docs: inbox/AAN — regenerate docx derivatives [aan-docx-regen]
</commit_message>
<xml_diff>
--- a/inbox/Application Aware Networking/Book_09_FedAAN_Database_Consolidation_Network_Physics.docx
+++ b/inbox/Application Aware Networking/Book_09_FedAAN_Database_Consolidation_Network_Physics.docx
@@ -106,7 +106,7 @@
                     <a:graphicData uri="http://schemas.openxmlformats.org/drawingml/2006/picture">
                       <pic:pic>
                         <pic:nvPicPr>
-                          <pic:cNvPr descr="C:\Program Files\Quarto\share\formats\docx\warning.png" id="11" name="Picture"/>
+                          <pic:cNvPr descr="/opt/quarto/share/formats/docx/warning.png" id="11" name="Picture"/>
                           <pic:cNvPicPr>
                             <a:picLocks noChangeArrowheads="1" noChangeAspect="1"/>
                           </pic:cNvPicPr>
@@ -280,7 +280,7 @@
                     <a:graphicData uri="http://schemas.openxmlformats.org/drawingml/2006/picture">
                       <pic:pic>
                         <pic:nvPicPr>
-                          <pic:cNvPr descr="C:\Program Files\Quarto\share\formats\docx\important.png" id="14" name="Picture"/>
+                          <pic:cNvPr descr="/opt/quarto/share/formats/docx/important.png" id="14" name="Picture"/>
                           <pic:cNvPicPr>
                             <a:picLocks noChangeArrowheads="1" noChangeAspect="1"/>
                           </pic:cNvPicPr>

</xml_diff>